<commit_message>
Show the Math and CS double major on every résumé
Rohan is a Mathematics and Computer Science double major, not a CS major
with a math minor. Updates the degree line and the General summary in
content.py, regenerates all 11 PDFs and DOCX files (each still fits on
one page), and fixes the LinkedIn headline and About text.

Co-Authored-By: Claude Opus 5.5 <noreply@anthropic.com>
Claude-Session: https://claude.ai/code/session_016nnYK4b62wApS8MJgjLPLS
</commit_message>
<xml_diff>
--- a/resumes/docx/Rohan_Malhotra_Resume_General.docx
+++ b/resumes/docx/Rohan_Malhotra_Resume_General.docx
@@ -146,7 +146,7 @@
           <w:i w:val="0"/>
           <w:sz w:val="20"/>
         </w:rPr>
-        <w:t>NYU Computer Science student (accelerated, May 2027) building quantitative, AI, and robotics systems: LLM tools and Spot robot vision at IBM, prediction-market risk research at Kalshi, and imaging tests for an ISS-deployed CubeSat.</w:t>
+        <w:t>NYU Math and Computer Science double major (accelerated, May 2027) building quantitative, AI, and robotics systems: LLM tools and Spot robot vision at IBM, prediction-market risk research at Kalshi, and imaging tests for an ISS-deployed CubeSat.</w:t>
       </w:r>
     </w:p>
     <w:p>
@@ -219,7 +219,7 @@
           <w:i/>
           <w:sz w:val="20"/>
         </w:rPr>
-        <w:t>B.A. in Computer Science, Minor in Mathematics</w:t>
+        <w:t>B.A. in Mathematics and Computer Science (Double Major)</w:t>
       </w:r>
       <w:r>
         <w:rPr>

</xml_diff>

<commit_message>
Show the Math and CS double major on every résumé (#7)
Rohan is a Mathematics and Computer Science double major, not a CS major
with a math minor. Updates the degree line and the General summary in
content.py, regenerates all 11 PDFs and DOCX files (each still fits on
one page), and fixes the LinkedIn headline and About text.


Claude-Session: https://claude.ai/code/session_016nnYK4b62wApS8MJgjLPLS

Co-authored-by: Claude <noreply@anthropic.com>
</commit_message>
<xml_diff>
--- a/resumes/docx/Rohan_Malhotra_Resume_General.docx
+++ b/resumes/docx/Rohan_Malhotra_Resume_General.docx
@@ -146,7 +146,7 @@
           <w:i w:val="0"/>
           <w:sz w:val="20"/>
         </w:rPr>
-        <w:t>NYU Computer Science student (accelerated, May 2027) building quantitative, AI, and robotics systems: LLM tools and Spot robot vision at IBM, prediction-market risk research at Kalshi, and imaging tests for an ISS-deployed CubeSat.</w:t>
+        <w:t>NYU Math and Computer Science double major (accelerated, May 2027) building quantitative, AI, and robotics systems: LLM tools and Spot robot vision at IBM, prediction-market risk research at Kalshi, and imaging tests for an ISS-deployed CubeSat.</w:t>
       </w:r>
     </w:p>
     <w:p>
@@ -219,7 +219,7 @@
           <w:i/>
           <w:sz w:val="20"/>
         </w:rPr>
-        <w:t>B.A. in Computer Science, Minor in Mathematics</w:t>
+        <w:t>B.A. in Mathematics and Computer Science (Double Major)</w:t>
       </w:r>
       <w:r>
         <w:rPr>

</xml_diff>